<commit_message>
Lägg till spelbar prototyp med hage-sparning och uppdatera konceptdokument
Co-Authored-By: Claude Sonnet 5.5 <noreply@anthropic.com>
Claude-Session: https://claude.ai/code/session_01RpaBtJaCyUHc8fCFVx5hKr
</commit_message>
<xml_diff>
--- a/Save-the-Horses_konceptdokument.docx
+++ b/Save-the-Horses_konceptdokument.docx
@@ -15,7 +15,7 @@
         <w:spacing w:after="100"/>
       </w:pPr>
       <w:r>
-        <w:t xml:space="preserve">Version 0.1 · 2026-10-22 · Arbetsnamn: Save the Horses (alternativ: Flocken, Hovslag)</w:t>
+        <w:t xml:space="preserve">Version 0.2 · 2026-10-22 · Arbetsnamn: Save the Horses (alternativ: Flocken, Hovslag)</w:t>
       </w:r>
     </w:p>
     <w:p>
@@ -155,10 +155,10 @@
           <w:b/>
           <w:bCs/>
         </w:rPr>
-        <w:t xml:space="preserve">5. Mål:</w:t>
-      </w:r>
-      <w:r>
-        <w:t xml:space="preserve"> Räknar hur många hästar som kom fram; de som klarade sig stannar i hemhagen.</w:t>
+        <w:t xml:space="preserve">5. Hage:</w:t>
+      </w:r>
+      <w:r>
+        <w:t xml:space="preserve"> Flocken når hagen, vilar och spelet sparas automatiskt.</w:t>
       </w:r>
     </w:p>
     <w:p>
@@ -267,7 +267,7 @@
         <w:t xml:space="preserve">Omstart:</w:t>
       </w:r>
       <w:r>
-        <w:t xml:space="preserve"> Noll hästar = banan börjar om, men hästarna man samlat i tidigare banor är kvar i hemhagen och ger en liten start­flock.</w:t>
+        <w:t xml:space="preserve"> Spelet sparas automatiskt varje gång flocken når en hage. Förlorar man alla hästar börjar man om från senaste hagen, med den flock man hade när man kom dit (eller från start om ingen hage nåtts).</w:t>
       </w:r>
     </w:p>
     <w:p>
@@ -562,7 +562,7 @@
                 <w:b w:val="false"/>
                 <w:bCs w:val="false"/>
               </w:rPr>
-              <w:t xml:space="preserve">Hästar faller bort; vid noll startar man om på banan</w:t>
+              <w:t xml:space="preserve">Hästar faller bort; vid noll startar man om från senaste hagen</w:t>
             </w:r>
           </w:p>
         </w:tc>
@@ -652,7 +652,7 @@
         <w:spacing w:after="60"/>
       </w:pPr>
       <w:r>
-        <w:t xml:space="preserve"> Enkel hemhage med antal räddade hästar. Ingen butik, inga konton.</w:t>
+        <w:t xml:space="preserve"> Hagar som checkpoints med automatisk sparning. Ingen butik, inga konton.</w:t>
       </w:r>
     </w:p>
     <w:p>
@@ -729,7 +729,7 @@
         <w:t xml:space="preserve">Frustration:</w:t>
       </w:r>
       <w:r>
-        <w:t xml:space="preserve"> Omstart kan kännas straffande – lösning: checkpoints och bevarade räddade hästar.</w:t>
+        <w:t xml:space="preserve"> Omstart kan kännas straffande – lösning: hagar som sparpunkter, där man behåller flocken man hade.</w:t>
       </w:r>
     </w:p>
     <w:sectPr>

</xml_diff>